<commit_message>
feat: add STROBE skill, reference bootstrap, and abstract JA translation
Ship the remaining paper-workflow tools and wire them through lab-paper, including AJG CSL and a safer paper:tag source path.

Co-authored-by: Cursor <cursoragent@cursor.com>
</commit_message>
<xml_diff>
--- a/skills/manuscript_md/templates/reference.docx
+++ b/skills/manuscript_md/templates/reference.docx
@@ -156,7 +156,7 @@
       <w:r>
         <w:t xml:space="preserve">. </w:t>
       </w:r>
-      <w:hyperlink r:id="rId7">
+      <w:hyperlink r:id="rId8">
         <w:r>
           <w:rPr>
             <w:rStyle w:val="Hyperlink"/>
@@ -303,8 +303,8 @@
       </w:r>
     </w:p>
     <w:sectPr>
-      <w:footerReference w:type="even" r:id="rId8"/>
-      <w:footerReference w:type="default" r:id="rId9"/>
+      <w:footerReference w:type="even" r:id="rId9"/>
+      <w:footerReference w:type="default" r:id="rId10"/>
       <w:footnotePr>
         <w:numRestart w:val="eachSect"/>
       </w:footnotePr>
@@ -349,7 +349,7 @@
       <w:rPr>
         <w:rStyle w:val="PageNumber"/>
       </w:rPr>
-      <w:id w:val="-1693754667"/>
+      <w:id w:val="636531344"/>
       <w:docPartObj>
         <w:docPartGallery w:val="Page Numbers (Bottom of Page)"/>
         <w:docPartUnique/>
@@ -406,7 +406,7 @@
       <w:rPr>
         <w:rStyle w:val="PageNumber"/>
       </w:rPr>
-      <w:id w:val="-1227523374"/>
+      <w:id w:val="2058122060"/>
       <w:docPartObj>
         <w:docPartGallery w:val="Page Numbers (Bottom of Page)"/>
         <w:docPartUnique/>
@@ -511,7 +511,7 @@
   <w:abstractNum w:abstractNumId="0" w15:restartNumberingAfterBreak="0">
     <w:nsid w:val="170CD2DE"/>
     <w:multiLevelType w:val="multilevel"/>
-    <w:tmpl w:val="B2D660B4"/>
+    <w:tmpl w:val="93021BAE"/>
     <w:lvl w:ilvl="0">
       <w:numFmt w:val="bullet"/>
       <w:lvlText w:val=" "/>
@@ -612,7 +612,7 @@
       </w:pPr>
     </w:lvl>
   </w:abstractNum>
-  <w:num w:numId="1" w16cid:durableId="75900318">
+  <w:num w:numId="1" w16cid:durableId="1661303341">
     <w:abstractNumId w:val="0"/>
   </w:num>
 </w:numbering>
@@ -1498,17 +1498,21 @@
     <w:pPr>
       <w:spacing w:before="20" w:after="60" w:line="288" w:lineRule="auto"/>
     </w:pPr>
+    <w:rPr>
+      <w:sz w:val="20"/>
+      <w:szCs w:val="20"/>
+    </w:rPr>
   </w:style>
   <w:style w:type="character" w:styleId="LineNumber">
     <w:name w:val="line number"/>
     <w:basedOn w:val="DefaultParagraphFont"/>
-    <w:rsid w:val="008B0EAC"/>
+    <w:rsid w:val="003F0E53"/>
   </w:style>
   <w:style w:type="paragraph" w:styleId="Footer">
     <w:name w:val="footer"/>
     <w:basedOn w:val="Normal"/>
     <w:link w:val="FooterChar"/>
-    <w:rsid w:val="008B0EAC"/>
+    <w:rsid w:val="003F0E53"/>
     <w:pPr>
       <w:tabs>
         <w:tab w:val="center" w:pos="4680"/>
@@ -1521,12 +1525,12 @@
     <w:name w:val="Footer Char"/>
     <w:basedOn w:val="DefaultParagraphFont"/>
     <w:link w:val="Footer"/>
-    <w:rsid w:val="008B0EAC"/>
+    <w:rsid w:val="003F0E53"/>
   </w:style>
   <w:style w:type="character" w:styleId="PageNumber">
     <w:name w:val="page number"/>
     <w:basedOn w:val="DefaultParagraphFont"/>
-    <w:rsid w:val="008B0EAC"/>
+    <w:rsid w:val="003F0E53"/>
   </w:style>
 </w:styles>
 </file>
@@ -1824,4 +1828,16 @@
     </a:ext>
   </a:extLst>
 </a:theme>
+</file>
+
+<file path=customXml/item1.xml><?xml version="1.0" encoding="utf-8"?>
+<b:Sources xmlns:b="http://schemas.openxmlformats.org/officeDocument/2006/bibliography" xmlns="http://schemas.openxmlformats.org/officeDocument/2006/bibliography" SelectedStyle="/APASixthEditionOfficeOnline.xsl" StyleName="APA" Version="6"/>
+</file>
+
+<file path=customXml/itemProps1.xml><?xml version="1.0" encoding="utf-8"?>
+<ds:datastoreItem xmlns:ds="http://schemas.openxmlformats.org/officeDocument/2006/customXml" ds:itemID="{91AF0801-F6E9-D649-BF03-94C5DA3D9F56}">
+  <ds:schemaRefs>
+    <ds:schemaRef ds:uri="http://schemas.openxmlformats.org/officeDocument/2006/bibliography"/>
+  </ds:schemaRefs>
+</ds:datastoreItem>
 </file>
</xml_diff>